<commit_message>
Digest 2026-09-08: steelman rule, questionnaire, fresh press
</commit_message>
<xml_diff>
--- a/docs/digests/2026-09-08.docx
+++ b/docs/digests/2026-09-08.docx
@@ -393,6 +393,66 @@
       </w:pPr>
       <w:r>
         <w:t xml:space="preserve">Instituted this daily digest for leadership.</w:t>
+      </w:r>
+    </w:p>
+    <w:p>
+      <w:pPr>
+        <w:pStyle w:val="Compact"/>
+        <w:numPr>
+          <w:ilvl w:val="0"/>
+          <w:numId w:val="1002"/>
+        </w:numPr>
+      </w:pPr>
+      <w:r>
+        <w:t xml:space="preserve">Ruled that every component must justify its existence before it is</w:t>
+      </w:r>
+      <w:r>
+        <w:t xml:space="preserve"> </w:t>
+      </w:r>
+      <w:r>
+        <w:t xml:space="preserve">tested (the</w:t>
+      </w:r>
+      <w:r>
+        <w:t xml:space="preserve"> </w:t>
+      </w:r>
+      <w:r>
+        <w:t xml:space="preserve">“steelman”</w:t>
+      </w:r>
+      <w:r>
+        <w:t xml:space="preserve"> </w:t>
+      </w:r>
+      <w:r>
+        <w:t xml:space="preserve">step); anything that cannot is cut or hidden even</w:t>
+      </w:r>
+      <w:r>
+        <w:t xml:space="preserve"> </w:t>
+      </w:r>
+      <w:r>
+        <w:t xml:space="preserve">if it works.</w:t>
+      </w:r>
+    </w:p>
+    <w:p>
+      <w:pPr>
+        <w:pStyle w:val="Compact"/>
+        <w:numPr>
+          <w:ilvl w:val="0"/>
+          <w:numId w:val="1002"/>
+        </w:numPr>
+      </w:pPr>
+      <w:r>
+        <w:t xml:space="preserve">Commissioned a workflow questionnaire for the Mixed Nuts translation</w:t>
+      </w:r>
+      <w:r>
+        <w:t xml:space="preserve"> </w:t>
+      </w:r>
+      <w:r>
+        <w:t xml:space="preserve">team and Geshe Michael (14 questions, replies by 15 September) so the</w:t>
+      </w:r>
+      <w:r>
+        <w:t xml:space="preserve"> </w:t>
+      </w:r>
+      <w:r>
+        <w:t xml:space="preserve">release fits how the team actually translates.</w:t>
       </w:r>
     </w:p>
     <w:bookmarkEnd w:id="10"/>
@@ -552,6 +612,41 @@
             </w:pPr>
             <w:r>
               <w:t xml:space="preserve">22 of 22 (+ menus)</w:t>
+            </w:r>
+          </w:p>
+        </w:tc>
+      </w:tr>
+      <w:tr>
+        <w:tc>
+          <w:tcPr/>
+          <w:p>
+            <w:pPr>
+              <w:pStyle w:val="Compact"/>
+            </w:pPr>
+            <w:r>
+              <w:t xml:space="preserve">Fresh DMG pressed and installed</w:t>
+            </w:r>
+          </w:p>
+        </w:tc>
+        <w:tc>
+          <w:tcPr/>
+          <w:p>
+            <w:pPr>
+              <w:pStyle w:val="Compact"/>
+            </w:pPr>
+            <w:r>
+              <w:t xml:space="preserve">—</w:t>
+            </w:r>
+          </w:p>
+        </w:tc>
+        <w:tc>
+          <w:tcPr/>
+          <w:p>
+            <w:pPr>
+              <w:pStyle w:val="Compact"/>
+            </w:pPr>
+            <w:r>
+              <w:t xml:space="preserve">1 (101/101 gates)</w:t>
             </w:r>
           </w:p>
         </w:tc>

</xml_diff>

<commit_message>
Digest 2026-09-08: questionnaire wording, tomorrow line
</commit_message>
<xml_diff>
--- a/docs/digests/2026-09-08.docx
+++ b/docs/digests/2026-09-08.docx
@@ -440,19 +440,19 @@
         </w:numPr>
       </w:pPr>
       <w:r>
-        <w:t xml:space="preserve">Commissioned a workflow questionnaire for the Mixed Nuts translation</w:t>
-      </w:r>
-      <w:r>
-        <w:t xml:space="preserve"> </w:t>
-      </w:r>
-      <w:r>
-        <w:t xml:space="preserve">team and Geshe Michael (14 questions, replies by 15 September) so the</w:t>
-      </w:r>
-      <w:r>
-        <w:t xml:space="preserve"> </w:t>
-      </w:r>
-      <w:r>
-        <w:t xml:space="preserve">release fits how the team actually translates.</w:t>
+        <w:t xml:space="preserve">Created a workflow questionnaire to send to the other translators on</w:t>
+      </w:r>
+      <w:r>
+        <w:t xml:space="preserve"> </w:t>
+      </w:r>
+      <w:r>
+        <w:t xml:space="preserve">the Mixed Nuts team and to Geshe Michael (14 questions, replies by 15</w:t>
+      </w:r>
+      <w:r>
+        <w:t xml:space="preserve"> </w:t>
+      </w:r>
+      <w:r>
+        <w:t xml:space="preserve">September) so the release fits how the team actually translates.</w:t>
       </w:r>
     </w:p>
     <w:bookmarkEnd w:id="10"/>
@@ -778,13 +778,19 @@
         <w:pStyle w:val="FirstParagraph"/>
       </w:pPr>
       <w:r>
-        <w:t xml:space="preserve">Begin the pane-by-pane walk with Adam, starting with the Overlay reading</w:t>
-      </w:r>
-      <w:r>
-        <w:t xml:space="preserve"> </w:t>
-      </w:r>
-      <w:r>
-        <w:t xml:space="preserve">pane (118 functions), recording a disposition for each.</w:t>
+        <w:t xml:space="preserve">Send the questionnaire; begin the pane-by-pane walk with Adam, starting</w:t>
+      </w:r>
+      <w:r>
+        <w:t xml:space="preserve"> </w:t>
+      </w:r>
+      <w:r>
+        <w:t xml:space="preserve">with the Overlay reading pane (118 functions), recording a justification and</w:t>
+      </w:r>
+      <w:r>
+        <w:t xml:space="preserve"> </w:t>
+      </w:r>
+      <w:r>
+        <w:t xml:space="preserve">a disposition for each.</w:t>
       </w:r>
     </w:p>
     <w:bookmarkEnd w:id="13"/>

</xml_diff>